<commit_message>
Edited manuscript to v4.
</commit_message>
<xml_diff>
--- a/paper/ElasticBounds-r_v3b.docx
+++ b/paper/ElasticBounds-r_v3b.docx
@@ -42,7 +42,7 @@
         <w:pStyle w:val="Date"/>
       </w:pPr>
       <w:r>
-        <w:t xml:space="preserve">14, July 2025</w:t>
+        <w:t xml:space="preserve">24, July 2025</w:t>
       </w:r>
     </w:p>
     <w:p>
@@ -972,6 +972,32 @@
         <w:pStyle w:val="FirstParagraph"/>
       </w:pPr>
       <w:r>
+        <w:t xml:space="preserve">(</w:t>
+      </w:r>
+      <w:r>
+        <w:rPr>
+          <w:b/>
+          <w:bCs/>
+        </w:rPr>
+        <w:t xml:space="preserve">camb76-inequalities?</w:t>
+      </w:r>
+      <w:r>
+        <w:t xml:space="preserve">)</w:t>
+      </w:r>
+    </w:p>
+    <w:p>
+      <w:pPr>
+        <w:pStyle w:val="BodyText"/>
+      </w:pPr>
+      <w:r>
+        <w:t xml:space="preserve">Shih &amp; Huang (1992)</w:t>
+      </w:r>
+    </w:p>
+    <w:p>
+      <w:pPr>
+        <w:pStyle w:val="BodyText"/>
+      </w:pPr>
+      <w:r>
         <w:t xml:space="preserve">Grether, D. M. (1976). On the Use of Ordinal Data in Correlation Analysis. American Sociological Review, 41(5), 908–912. https://doi.org/10.2307/2094741</w:t>
       </w:r>
     </w:p>
@@ -1013,6 +1039,56 @@
       </w:pPr>
       <w:r>
         <w:t xml:space="preserve">Robitzsch, A. (2022). On the Bias in Confirmatory Factor Analysis When Treating Discrete Variables as Ordinal Instead of Continuous. Axioms, 11(4), Article 4. https://doi.org/10.3390/axioms11040162</w:t>
+      </w:r>
+    </w:p>
+    <w:p>
+      <w:pPr>
+        <w:pStyle w:val="BodyText"/>
+      </w:pPr>
+      <w:r>
+        <w:t xml:space="preserve">Fréchet (1951)</w:t>
+      </w:r>
+    </w:p>
+    <w:p>
+      <w:pPr>
+        <w:pStyle w:val="BodyText"/>
+      </w:pPr>
+      <w:r>
+        <w:t xml:space="preserve">Whitt (1976)</w:t>
+      </w:r>
+    </w:p>
+    <w:p>
+      <w:pPr>
+        <w:pStyle w:val="BodyText"/>
+      </w:pPr>
+      <w:r>
+        <w:t xml:space="preserve">(</w:t>
+      </w:r>
+      <w:r>
+        <w:rPr>
+          <w:b/>
+          <w:bCs/>
+        </w:rPr>
+        <w:t xml:space="preserve">hoef40-masstabinvariante?</w:t>
+      </w:r>
+      <w:r>
+        <w:t xml:space="preserve">)</w:t>
+      </w:r>
+    </w:p>
+    <w:p>
+      <w:pPr>
+        <w:pStyle w:val="BodyText"/>
+      </w:pPr>
+      <w:r>
+        <w:t xml:space="preserve">Lehmann (1966)</w:t>
+      </w:r>
+    </w:p>
+    <w:p>
+      <w:pPr>
+        <w:pStyle w:val="BodyText"/>
+      </w:pPr>
+      <w:r>
+        <w:t xml:space="preserve">Tchen (1980)</w:t>
       </w:r>
     </w:p>
     <w:bookmarkEnd w:id="22"/>
@@ -9975,7 +10051,7 @@
       </w:r>
     </w:p>
     <w:bookmarkEnd w:id="44"/>
-    <w:bookmarkStart w:id="54" w:name="references"/>
+    <w:bookmarkStart w:id="59" w:name="references"/>
     <w:p>
       <w:pPr>
         <w:pStyle w:val="Heading1"/>
@@ -9984,7 +10060,7 @@
         <w:t xml:space="preserve">10. References</w:t>
       </w:r>
     </w:p>
-    <w:bookmarkStart w:id="53" w:name="refs"/>
+    <w:bookmarkStart w:id="58" w:name="refs"/>
     <w:bookmarkStart w:id="46" w:name="ref-aitc89-measures"/>
     <w:p>
       <w:pPr>
@@ -10032,7 +10108,43 @@
       </w:hyperlink>
     </w:p>
     <w:bookmarkEnd w:id="46"/>
-    <w:bookmarkStart w:id="47" w:name="ref-hard52-inequalities"/>
+    <w:bookmarkStart w:id="47" w:name="ref-frec51-tableaux"/>
+    <w:p>
+      <w:pPr>
+        <w:pStyle w:val="Bibliography"/>
+      </w:pPr>
+      <w:r>
+        <w:t xml:space="preserve">Fréchet, M. (1951). Sur les tableaux de corrélation dont les marges sont données.</w:t>
+      </w:r>
+      <w:r>
+        <w:t xml:space="preserve"> </w:t>
+      </w:r>
+      <w:r>
+        <w:rPr>
+          <w:i/>
+          <w:iCs/>
+        </w:rPr>
+        <w:t xml:space="preserve">Annales de l’Université de Lyon</w:t>
+      </w:r>
+      <w:r>
+        <w:t xml:space="preserve">,</w:t>
+      </w:r>
+      <w:r>
+        <w:t xml:space="preserve"> </w:t>
+      </w:r>
+      <w:r>
+        <w:rPr>
+          <w:i/>
+          <w:iCs/>
+        </w:rPr>
+        <w:t xml:space="preserve">14</w:t>
+      </w:r>
+      <w:r>
+        <w:t xml:space="preserve">, 53–77.</w:t>
+      </w:r>
+    </w:p>
+    <w:bookmarkEnd w:id="47"/>
+    <w:bookmarkStart w:id="48" w:name="ref-hard52-inequalities"/>
     <w:p>
       <w:pPr>
         <w:pStyle w:val="Bibliography"/>
@@ -10054,8 +10166,8 @@
         <w:t xml:space="preserve">. Cambridge University Press.</w:t>
       </w:r>
     </w:p>
-    <w:bookmarkEnd w:id="47"/>
-    <w:bookmarkStart w:id="48" w:name="ref-jaec09-positive"/>
+    <w:bookmarkEnd w:id="48"/>
+    <w:bookmarkStart w:id="49" w:name="ref-jaec09-positive"/>
     <w:p>
       <w:pPr>
         <w:pStyle w:val="Bibliography"/>
@@ -10077,8 +10189,65 @@
         <w:t xml:space="preserve">.</w:t>
       </w:r>
     </w:p>
-    <w:bookmarkEnd w:id="48"/>
-    <w:bookmarkStart w:id="49" w:name="ref-mish09-note"/>
+    <w:bookmarkEnd w:id="49"/>
+    <w:bookmarkStart w:id="50" w:name="ref-lehm66-concepts"/>
+    <w:p>
+      <w:pPr>
+        <w:pStyle w:val="Bibliography"/>
+      </w:pPr>
+      <w:r>
+        <w:t xml:space="preserve">Lehmann, E. L. (1966). Some</w:t>
+      </w:r>
+      <w:r>
+        <w:t xml:space="preserve"> </w:t>
+      </w:r>
+      <w:r>
+        <w:t xml:space="preserve">Concepts</w:t>
+      </w:r>
+      <w:r>
+        <w:t xml:space="preserve"> </w:t>
+      </w:r>
+      <w:r>
+        <w:t xml:space="preserve">of</w:t>
+      </w:r>
+      <w:r>
+        <w:t xml:space="preserve"> </w:t>
+      </w:r>
+      <w:r>
+        <w:t xml:space="preserve">Dependence</w:t>
+      </w:r>
+      <w:r>
+        <w:t xml:space="preserve">.</w:t>
+      </w:r>
+      <w:r>
+        <w:t xml:space="preserve"> </w:t>
+      </w:r>
+      <w:r>
+        <w:rPr>
+          <w:i/>
+          <w:iCs/>
+        </w:rPr>
+        <w:t xml:space="preserve">The Annals of Mathematical Statistics</w:t>
+      </w:r>
+      <w:r>
+        <w:t xml:space="preserve">,</w:t>
+      </w:r>
+      <w:r>
+        <w:t xml:space="preserve"> </w:t>
+      </w:r>
+      <w:r>
+        <w:rPr>
+          <w:i/>
+          <w:iCs/>
+        </w:rPr>
+        <w:t xml:space="preserve">37</w:t>
+      </w:r>
+      <w:r>
+        <w:t xml:space="preserve">(5), 1137–1153.</w:t>
+      </w:r>
+    </w:p>
+    <w:bookmarkEnd w:id="50"/>
+    <w:bookmarkStart w:id="51" w:name="ref-mish09-note"/>
     <w:p>
       <w:pPr>
         <w:pStyle w:val="Bibliography"/>
@@ -10100,8 +10269,8 @@
         <w:t xml:space="preserve">.</w:t>
       </w:r>
     </w:p>
-    <w:bookmarkEnd w:id="49"/>
-    <w:bookmarkStart w:id="51" w:name="ref-shan23-impact"/>
+    <w:bookmarkEnd w:id="51"/>
+    <w:bookmarkStart w:id="53" w:name="ref-shan23-impact"/>
     <w:p>
       <w:pPr>
         <w:pStyle w:val="Bibliography"/>
@@ -10192,7 +10361,7 @@
       <w:r>
         <w:t xml:space="preserve"> </w:t>
       </w:r>
-      <w:hyperlink r:id="rId50">
+      <w:hyperlink r:id="rId52">
         <w:r>
           <w:rPr>
             <w:rStyle w:val="Hyperlink"/>
@@ -10201,8 +10370,133 @@
         </w:r>
       </w:hyperlink>
     </w:p>
-    <w:bookmarkEnd w:id="51"/>
-    <w:bookmarkStart w:id="52" w:name="ref-whit76-bivariate"/>
+    <w:bookmarkEnd w:id="53"/>
+    <w:bookmarkStart w:id="55" w:name="ref-shih92-evaluating"/>
+    <w:p>
+      <w:pPr>
+        <w:pStyle w:val="Bibliography"/>
+      </w:pPr>
+      <w:r>
+        <w:t xml:space="preserve">Shih, W. J., &amp; Huang, W.-M. (1992). Evaluating</w:t>
+      </w:r>
+      <w:r>
+        <w:t xml:space="preserve"> </w:t>
+      </w:r>
+      <w:r>
+        <w:t xml:space="preserve">Correlation</w:t>
+      </w:r>
+      <w:r>
+        <w:t xml:space="preserve"> </w:t>
+      </w:r>
+      <w:r>
+        <w:t xml:space="preserve">with</w:t>
+      </w:r>
+      <w:r>
+        <w:t xml:space="preserve"> </w:t>
+      </w:r>
+      <w:r>
+        <w:t xml:space="preserve">Proper Bounds</w:t>
+      </w:r>
+      <w:r>
+        <w:t xml:space="preserve">.</w:t>
+      </w:r>
+      <w:r>
+        <w:t xml:space="preserve"> </w:t>
+      </w:r>
+      <w:r>
+        <w:rPr>
+          <w:i/>
+          <w:iCs/>
+        </w:rPr>
+        <w:t xml:space="preserve">Biometrics</w:t>
+      </w:r>
+      <w:r>
+        <w:t xml:space="preserve">,</w:t>
+      </w:r>
+      <w:r>
+        <w:t xml:space="preserve"> </w:t>
+      </w:r>
+      <w:r>
+        <w:rPr>
+          <w:i/>
+          <w:iCs/>
+        </w:rPr>
+        <w:t xml:space="preserve">48</w:t>
+      </w:r>
+      <w:r>
+        <w:t xml:space="preserve">(4), 1207–1213.</w:t>
+      </w:r>
+      <w:r>
+        <w:t xml:space="preserve"> </w:t>
+      </w:r>
+      <w:hyperlink r:id="rId54">
+        <w:r>
+          <w:rPr>
+            <w:rStyle w:val="Hyperlink"/>
+          </w:rPr>
+          <w:t xml:space="preserve">https://doi.org/10.2307/2532712</w:t>
+        </w:r>
+      </w:hyperlink>
+    </w:p>
+    <w:bookmarkEnd w:id="55"/>
+    <w:bookmarkStart w:id="56" w:name="ref-tche80-inequalities"/>
+    <w:p>
+      <w:pPr>
+        <w:pStyle w:val="Bibliography"/>
+      </w:pPr>
+      <w:r>
+        <w:t xml:space="preserve">Tchen, A. H. (1980). Inequalities for</w:t>
+      </w:r>
+      <w:r>
+        <w:t xml:space="preserve"> </w:t>
+      </w:r>
+      <w:r>
+        <w:t xml:space="preserve">Distributions</w:t>
+      </w:r>
+      <w:r>
+        <w:t xml:space="preserve"> </w:t>
+      </w:r>
+      <w:r>
+        <w:t xml:space="preserve">with</w:t>
+      </w:r>
+      <w:r>
+        <w:t xml:space="preserve"> </w:t>
+      </w:r>
+      <w:r>
+        <w:t xml:space="preserve">Given Marginals</w:t>
+      </w:r>
+      <w:r>
+        <w:t xml:space="preserve">.</w:t>
+      </w:r>
+      <w:r>
+        <w:t xml:space="preserve"> </w:t>
+      </w:r>
+      <w:r>
+        <w:rPr>
+          <w:i/>
+          <w:iCs/>
+        </w:rPr>
+        <w:t xml:space="preserve">The Annals of Probability</w:t>
+      </w:r>
+      <w:r>
+        <w:t xml:space="preserve">,</w:t>
+      </w:r>
+      <w:r>
+        <w:t xml:space="preserve"> </w:t>
+      </w:r>
+      <w:r>
+        <w:rPr>
+          <w:i/>
+          <w:iCs/>
+        </w:rPr>
+        <w:t xml:space="preserve">8</w:t>
+      </w:r>
+      <w:r>
+        <w:t xml:space="preserve">(4), 814–827.</w:t>
+      </w:r>
+    </w:p>
+    <w:bookmarkEnd w:id="56"/>
+    <w:bookmarkStart w:id="57" w:name="ref-whit76-bivariate"/>
     <w:p>
       <w:pPr>
         <w:pStyle w:val="Bibliography"/>
@@ -10258,15 +10552,15 @@
         <w:t xml:space="preserve">(6), 1280–1289.</w:t>
       </w:r>
     </w:p>
-    <w:bookmarkEnd w:id="52"/>
-    <w:bookmarkEnd w:id="53"/>
+    <w:bookmarkEnd w:id="57"/>
+    <w:bookmarkEnd w:id="58"/>
     <w:p>
       <w:r>
         <w:br w:type="page"/>
       </w:r>
     </w:p>
-    <w:bookmarkEnd w:id="54"/>
-    <w:bookmarkStart w:id="55" w:name="appendix-a-mathematical-proofs"/>
+    <w:bookmarkEnd w:id="59"/>
+    <w:bookmarkStart w:id="60" w:name="appendix-a-mathematical-proofs"/>
     <w:p>
       <w:pPr>
         <w:pStyle w:val="Heading1"/>
@@ -10287,8 +10581,8 @@
         <w:t xml:space="preserve">Formal derivations of optimal coupling and analytical bounds</w:t>
       </w:r>
     </w:p>
-    <w:bookmarkEnd w:id="55"/>
-    <w:bookmarkStart w:id="56" w:name="Xcbc1e63e2676ae6940216baa962f3b1416b12e5"/>
+    <w:bookmarkEnd w:id="60"/>
+    <w:bookmarkStart w:id="61" w:name="Xcbc1e63e2676ae6940216baa962f3b1416b12e5"/>
     <w:p>
       <w:pPr>
         <w:pStyle w:val="Heading1"/>
@@ -10324,8 +10618,8 @@
         <w:t xml:space="preserve">Description of randomization testing features</w:t>
       </w:r>
     </w:p>
-    <w:bookmarkEnd w:id="56"/>
-    <w:bookmarkStart w:id="57" w:name="X0fa965c16005f1205fcf7fee981caab2b595cd3"/>
+    <w:bookmarkEnd w:id="61"/>
+    <w:bookmarkStart w:id="62" w:name="X0fa965c16005f1205fcf7fee981caab2b595cd3"/>
     <w:p>
       <w:pPr>
         <w:pStyle w:val="Heading1"/>
@@ -10346,7 +10640,7 @@
         <w:t xml:space="preserve">Supplementary empirical examples, simulation results</w:t>
       </w:r>
     </w:p>
-    <w:bookmarkEnd w:id="57"/>
+    <w:bookmarkEnd w:id="62"/>
     <w:sectPr/>
   </w:body>
 </w:document>

</xml_diff>